<commit_message>
chore(patents): regenerate docx for patents 01/04/06/07
Re-run fill_template after OMML radical fix and aspect-ratio scaling
so formulas and figures render correctly without markdown changes.

Co-authored-by: Cursor <cursoragent@cursor.com>
</commit_message>
<xml_diff>
--- a/patents/patent_06_mocap_task_allocation_20260423/patent_06_disclosure.docx
+++ b/patents/patent_06_mocap_task_allocation_20260423/patent_06_disclosure.docx
@@ -10742,6 +10742,218 @@
         <w:t xml:space="preserve">[7] Google OR-Tools: Operations Research Tools. https://developers.google.com/optimization</w:t>
       </w:r>
     </w:p>
+    <w:p>
+      <w:pPr>
+        <w:jc w:val="center"/>
+        <w:spacing w:before="160" w:after="80" w:lineRule="auto" w:line="240"/>
+      </w:pPr>
+      <w:r>
+        <w:drawing>
+          <wp:inline xmlns:a="http://schemas.openxmlformats.org/drawingml/2006/main" xmlns:pic="http://schemas.openxmlformats.org/drawingml/2006/picture">
+            <wp:extent cx="5029200" cy="2743200"/>
+            <wp:docPr id="16" name="Picture 16"/>
+            <wp:cNvGraphicFramePr>
+              <a:graphicFrameLocks noChangeAspect="1"/>
+            </wp:cNvGraphicFramePr>
+            <a:graphic>
+              <a:graphicData uri="http://schemas.openxmlformats.org/drawingml/2006/picture">
+                <pic:pic>
+                  <pic:nvPicPr>
+                    <pic:cNvPr id="0" name="image.png"/>
+                    <pic:cNvPicPr/>
+                  </pic:nvPicPr>
+                  <pic:blipFill>
+                    <a:blip r:embed="rId17"/>
+                    <a:stretch>
+                      <a:fillRect/>
+                    </a:stretch>
+                  </pic:blipFill>
+                  <pic:spPr>
+                    <a:xfrm>
+                      <a:off x="0" y="0"/>
+                      <a:ext cx="5029200" cy="2743200"/>
+                    </a:xfrm>
+                    <a:prstGeom prst="rect"/>
+                  </pic:spPr>
+                </pic:pic>
+              </a:graphicData>
+            </a:graphic>
+          </wp:inline>
+        </w:drawing>
+      </w:r>
+    </w:p>
+    <w:p>
+      <w:pPr>
+        <w:jc w:val="center"/>
+        <w:spacing w:before="80" w:after="160" w:lineRule="auto" w:line="280"/>
+      </w:pPr>
+      <w:r>
+        <w:rPr>
+          <w:rFonts w:ascii="宋体" w:hAnsi="宋体" w:eastAsia="宋体" w:cs="宋体"/>
+          <w:sz w:val="21"/>
+        </w:rPr>
+        <w:t>图1 system architecture</w:t>
+      </w:r>
+    </w:p>
+    <w:p>
+      <w:pPr>
+        <w:jc w:val="center"/>
+        <w:spacing w:before="160" w:after="80" w:lineRule="auto" w:line="240"/>
+      </w:pPr>
+      <w:r>
+        <w:drawing>
+          <wp:inline xmlns:a="http://schemas.openxmlformats.org/drawingml/2006/main" xmlns:pic="http://schemas.openxmlformats.org/drawingml/2006/picture">
+            <wp:extent cx="5029200" cy="2743200"/>
+            <wp:docPr id="17" name="Picture 17"/>
+            <wp:cNvGraphicFramePr>
+              <a:graphicFrameLocks noChangeAspect="1"/>
+            </wp:cNvGraphicFramePr>
+            <a:graphic>
+              <a:graphicData uri="http://schemas.openxmlformats.org/drawingml/2006/picture">
+                <pic:pic>
+                  <pic:nvPicPr>
+                    <pic:cNvPr id="0" name="image.png"/>
+                    <pic:cNvPicPr/>
+                  </pic:nvPicPr>
+                  <pic:blipFill>
+                    <a:blip r:embed="rId18"/>
+                    <a:stretch>
+                      <a:fillRect/>
+                    </a:stretch>
+                  </pic:blipFill>
+                  <pic:spPr>
+                    <a:xfrm>
+                      <a:off x="0" y="0"/>
+                      <a:ext cx="5029200" cy="2743200"/>
+                    </a:xfrm>
+                    <a:prstGeom prst="rect"/>
+                  </pic:spPr>
+                </pic:pic>
+              </a:graphicData>
+            </a:graphic>
+          </wp:inline>
+        </w:drawing>
+      </w:r>
+    </w:p>
+    <w:p>
+      <w:pPr>
+        <w:jc w:val="center"/>
+        <w:spacing w:before="80" w:after="160" w:lineRule="auto" w:line="280"/>
+      </w:pPr>
+      <w:r>
+        <w:rPr>
+          <w:rFonts w:ascii="宋体" w:hAnsi="宋体" w:eastAsia="宋体" w:cs="宋体"/>
+          <w:sz w:val="21"/>
+        </w:rPr>
+        <w:t>图2 method flowchart</w:t>
+      </w:r>
+    </w:p>
+    <w:p>
+      <w:pPr>
+        <w:jc w:val="center"/>
+        <w:spacing w:before="160" w:after="80" w:lineRule="auto" w:line="240"/>
+      </w:pPr>
+      <w:r>
+        <w:drawing>
+          <wp:inline xmlns:a="http://schemas.openxmlformats.org/drawingml/2006/main" xmlns:pic="http://schemas.openxmlformats.org/drawingml/2006/picture">
+            <wp:extent cx="5029200" cy="2743200"/>
+            <wp:docPr id="18" name="Picture 18"/>
+            <wp:cNvGraphicFramePr>
+              <a:graphicFrameLocks noChangeAspect="1"/>
+            </wp:cNvGraphicFramePr>
+            <a:graphic>
+              <a:graphicData uri="http://schemas.openxmlformats.org/drawingml/2006/picture">
+                <pic:pic>
+                  <pic:nvPicPr>
+                    <pic:cNvPr id="0" name="image.png"/>
+                    <pic:cNvPicPr/>
+                  </pic:nvPicPr>
+                  <pic:blipFill>
+                    <a:blip r:embed="rId19"/>
+                    <a:stretch>
+                      <a:fillRect/>
+                    </a:stretch>
+                  </pic:blipFill>
+                  <pic:spPr>
+                    <a:xfrm>
+                      <a:off x="0" y="0"/>
+                      <a:ext cx="5029200" cy="2743200"/>
+                    </a:xfrm>
+                    <a:prstGeom prst="rect"/>
+                  </pic:spPr>
+                </pic:pic>
+              </a:graphicData>
+            </a:graphic>
+          </wp:inline>
+        </w:drawing>
+      </w:r>
+    </w:p>
+    <w:p>
+      <w:pPr>
+        <w:jc w:val="center"/>
+        <w:spacing w:before="80" w:after="160" w:lineRule="auto" w:line="280"/>
+      </w:pPr>
+      <w:r>
+        <w:rPr>
+          <w:rFonts w:ascii="宋体" w:hAnsi="宋体" w:eastAsia="宋体" w:cs="宋体"/>
+          <w:sz w:val="21"/>
+        </w:rPr>
+        <w:t>图3 bipartite matching</w:t>
+      </w:r>
+    </w:p>
+    <w:p>
+      <w:pPr>
+        <w:jc w:val="center"/>
+        <w:spacing w:before="160" w:after="80" w:lineRule="auto" w:line="240"/>
+      </w:pPr>
+      <w:r>
+        <w:drawing>
+          <wp:inline xmlns:a="http://schemas.openxmlformats.org/drawingml/2006/main" xmlns:pic="http://schemas.openxmlformats.org/drawingml/2006/picture">
+            <wp:extent cx="5029200" cy="2743200"/>
+            <wp:docPr id="19" name="Picture 19"/>
+            <wp:cNvGraphicFramePr>
+              <a:graphicFrameLocks noChangeAspect="1"/>
+            </wp:cNvGraphicFramePr>
+            <a:graphic>
+              <a:graphicData uri="http://schemas.openxmlformats.org/drawingml/2006/picture">
+                <pic:pic>
+                  <pic:nvPicPr>
+                    <pic:cNvPr id="0" name="image.png"/>
+                    <pic:cNvPicPr/>
+                  </pic:nvPicPr>
+                  <pic:blipFill>
+                    <a:blip r:embed="rId20"/>
+                    <a:stretch>
+                      <a:fillRect/>
+                    </a:stretch>
+                  </pic:blipFill>
+                  <pic:spPr>
+                    <a:xfrm>
+                      <a:off x="0" y="0"/>
+                      <a:ext cx="5029200" cy="2743200"/>
+                    </a:xfrm>
+                    <a:prstGeom prst="rect"/>
+                  </pic:spPr>
+                </pic:pic>
+              </a:graphicData>
+            </a:graphic>
+          </wp:inline>
+        </w:drawing>
+      </w:r>
+    </w:p>
+    <w:p>
+      <w:pPr>
+        <w:jc w:val="center"/>
+        <w:spacing w:before="80" w:after="160" w:lineRule="auto" w:line="280"/>
+      </w:pPr>
+      <w:r>
+        <w:rPr>
+          <w:rFonts w:ascii="宋体" w:hAnsi="宋体" w:eastAsia="宋体" w:cs="宋体"/>
+          <w:sz w:val="21"/>
+        </w:rPr>
+        <w:t>图4 optimization model</w:t>
+      </w:r>
+    </w:p>
     <w:sectPr>
       <w:headerReference w:type="even" r:id="rId9"/>
       <w:headerReference w:type="default" r:id="rId10"/>

</xml_diff>